<commit_message>
Sprint2 Feedbackformulier bijrollen gemaakt
</commit_message>
<xml_diff>
--- a/Algemene Documentatie/Documentatie Yorick/Sprint 2 - Yorick - Feedbackformulier voor bijrollen.docx
+++ b/Algemene Documentatie/Documentatie Yorick/Sprint 2 - Yorick - Feedbackformulier voor bijrollen.docx
@@ -320,7 +320,7 @@
               <w:jc w:val="center"/>
             </w:pPr>
             <w:r>
-              <w:t>O/M/V/G</w:t>
+              <w:t>G</w:t>
             </w:r>
           </w:p>
         </w:tc>
@@ -335,7 +335,7 @@
               <w:spacing w:after="0"/>
             </w:pPr>
             <w:r>
-              <w:t>…</w:t>
+              <w:t>Hij had zijn presentatie op tijd af en was ook op tijd klaar om te presenteren.</w:t>
             </w:r>
           </w:p>
         </w:tc>
@@ -390,7 +390,7 @@
               <w:jc w:val="center"/>
             </w:pPr>
             <w:r>
-              <w:t>O/M/V/G</w:t>
+              <w:t>V</w:t>
             </w:r>
           </w:p>
         </w:tc>
@@ -404,7 +404,7 @@
               <w:spacing w:after="0"/>
             </w:pPr>
             <w:r>
-              <w:t>…</w:t>
+              <w:t>Zijn presentatie zat voldoende in elkaar. Mischien voorbeelden toevoegen van onze inspiratie.</w:t>
             </w:r>
           </w:p>
         </w:tc>
@@ -459,7 +459,7 @@
               <w:jc w:val="center"/>
             </w:pPr>
             <w:r>
-              <w:t>O/M/V/G</w:t>
+              <w:t>G</w:t>
             </w:r>
           </w:p>
         </w:tc>
@@ -473,7 +473,7 @@
               <w:spacing w:after="0"/>
             </w:pPr>
             <w:r>
-              <w:t>…</w:t>
+              <w:t>Hij communiceerde goed met ons over wat we al hadden en wat hij nodig had.</w:t>
             </w:r>
           </w:p>
         </w:tc>
@@ -528,7 +528,7 @@
               <w:jc w:val="center"/>
             </w:pPr>
             <w:r>
-              <w:t>O/M/V/G</w:t>
+              <w:t>G</w:t>
             </w:r>
           </w:p>
         </w:tc>
@@ -542,7 +542,7 @@
               <w:spacing w:after="0"/>
             </w:pPr>
             <w:r>
-              <w:t>…</w:t>
+              <w:t>Hij werkte goed samen met ons en zorgde ervoor dat hij van ons kreeg wat hij nodig had.</w:t>
             </w:r>
           </w:p>
         </w:tc>
@@ -615,7 +615,7 @@
               <w:jc w:val="center"/>
             </w:pPr>
             <w:r>
-              <w:t>O/M/V/G</w:t>
+              <w:t>V</w:t>
             </w:r>
           </w:p>
         </w:tc>
@@ -629,7 +629,7 @@
               <w:spacing w:after="0"/>
             </w:pPr>
             <w:r>
-              <w:t>…</w:t>
+              <w:t>Hij was goed bezig voor verbeteringen zoals wij overlegde kort over de map nadat ik hem vierkant had gemaakt.</w:t>
             </w:r>
           </w:p>
         </w:tc>
@@ -651,6 +651,7 @@
           <w:b/>
           <w:bCs/>
         </w:rPr>
+        <w:lastRenderedPageBreak/>
         <w:t>3. Sterke punten</w:t>
       </w:r>
     </w:p>
@@ -666,7 +667,7 @@
         <w:t xml:space="preserve"> </w:t>
       </w:r>
       <w:r>
-        <w:t>…</w:t>
+        <w:t>Communicatie</w:t>
       </w:r>
     </w:p>
     <w:p>
@@ -681,7 +682,7 @@
         <w:t xml:space="preserve"> </w:t>
       </w:r>
       <w:r>
-        <w:t>…</w:t>
+        <w:t>initiatief</w:t>
       </w:r>
     </w:p>
     <w:p>
@@ -693,11 +694,10 @@
         </w:numPr>
       </w:pPr>
       <w:r>
-        <w:lastRenderedPageBreak/>
         <w:t xml:space="preserve"> </w:t>
       </w:r>
       <w:r>
-        <w:t>…</w:t>
+        <w:t>Kwaliteit werk</w:t>
       </w:r>
     </w:p>
     <w:p>
@@ -729,46 +729,8 @@
         </w:numPr>
       </w:pPr>
       <w:r>
-        <w:t>…</w:t>
-      </w:r>
-    </w:p>
-    <w:p>
-      <w:pPr>
-        <w:pStyle w:val="ListParagraph"/>
-        <w:numPr>
-          <w:ilvl w:val="0"/>
-          <w:numId w:val="13"/>
-        </w:numPr>
-      </w:pPr>
-      <w:r>
-        <w:t xml:space="preserve"> </w:t>
-      </w:r>
-      <w:r>
-        <w:t>…</w:t>
-      </w:r>
-    </w:p>
-    <w:p>
-      <w:pPr>
-        <w:pStyle w:val="ListParagraph"/>
-        <w:numPr>
-          <w:ilvl w:val="0"/>
-          <w:numId w:val="13"/>
-        </w:numPr>
-      </w:pPr>
-      <w:r>
-        <w:t xml:space="preserve"> </w:t>
-      </w:r>
-      <w:r>
-        <w:t>…</w:t>
-      </w:r>
-    </w:p>
-    <w:p>
-      <w:pPr>
-        <w:rPr>
-          <w:b/>
-          <w:bCs/>
-        </w:rPr>
-      </w:pPr>
+        <w:t>Samenwerken / overleggen met elkaar</w:t>
+      </w:r>
     </w:p>
     <w:p>
       <w:pPr>
@@ -794,7 +756,7 @@
     </w:p>
     <w:p>
       <w:r>
-        <w:t>…</w:t>
+        <w:t>Wat meer samenwerken / overleggen zodat alles ook makkelijk bij elkaar kan komen</w:t>
       </w:r>
     </w:p>
     <w:p/>
@@ -824,10 +786,7 @@
         <w:br/>
       </w:r>
       <w:r>
-        <w:t xml:space="preserve">Naam rol eigenaar: </w:t>
-      </w:r>
-      <w:r>
-        <w:t>Fleur Spannenberg</w:t>
+        <w:t>Naam rol eigenaar: Fleur Spannenberg</w:t>
       </w:r>
     </w:p>
     <w:p>
@@ -1070,7 +1029,7 @@
               <w:jc w:val="center"/>
             </w:pPr>
             <w:r>
-              <w:t>O/M/V/G</w:t>
+              <w:t>G</w:t>
             </w:r>
           </w:p>
         </w:tc>
@@ -1085,7 +1044,7 @@
               <w:spacing w:after="0"/>
             </w:pPr>
             <w:r>
-              <w:t>…</w:t>
+              <w:t>Ja ze had op tijd de notulen gemaakt voor presentatie en retrospective</w:t>
             </w:r>
           </w:p>
         </w:tc>
@@ -1140,7 +1099,7 @@
               <w:jc w:val="center"/>
             </w:pPr>
             <w:r>
-              <w:t>O/M/V/G</w:t>
+              <w:t>G</w:t>
             </w:r>
           </w:p>
         </w:tc>
@@ -1154,7 +1113,7 @@
               <w:spacing w:after="0"/>
             </w:pPr>
             <w:r>
-              <w:t>…</w:t>
+              <w:t>Ze had goed notulen gemaakt voor de benodigde documenten en presentatie.</w:t>
             </w:r>
           </w:p>
         </w:tc>
@@ -1209,7 +1168,7 @@
               <w:jc w:val="center"/>
             </w:pPr>
             <w:r>
-              <w:t>O/M/V/G</w:t>
+              <w:t>G</w:t>
             </w:r>
           </w:p>
         </w:tc>
@@ -1223,7 +1182,7 @@
               <w:spacing w:after="0"/>
             </w:pPr>
             <w:r>
-              <w:t>…</w:t>
+              <w:t>Ze communiceerde goed met ons over het werk van ons en stelde vragen.</w:t>
             </w:r>
           </w:p>
         </w:tc>
@@ -1278,7 +1237,7 @@
               <w:jc w:val="center"/>
             </w:pPr>
             <w:r>
-              <w:t>O/M/V/G</w:t>
+              <w:t>V</w:t>
             </w:r>
           </w:p>
         </w:tc>
@@ -1292,7 +1251,7 @@
               <w:spacing w:after="0"/>
             </w:pPr>
             <w:r>
-              <w:t>…</w:t>
+              <w:t>Het kon net zoals bij de rest van het team beter om te overleggen en onze werk te laten zien zodat we meer op de zelfde wavelength zitten.</w:t>
             </w:r>
           </w:p>
         </w:tc>
@@ -1365,7 +1324,7 @@
               <w:jc w:val="center"/>
             </w:pPr>
             <w:r>
-              <w:t>O/M/V/G</w:t>
+              <w:t>V</w:t>
             </w:r>
           </w:p>
         </w:tc>
@@ -1379,7 +1338,7 @@
               <w:spacing w:after="0"/>
             </w:pPr>
             <w:r>
-              <w:t>…</w:t>
+              <w:t>Op zich wel maar omdat we niet zo veel overlegde over onze taken kon het beter.</w:t>
             </w:r>
           </w:p>
         </w:tc>
@@ -1416,7 +1375,7 @@
         <w:t xml:space="preserve"> </w:t>
       </w:r>
       <w:r>
-        <w:t>…</w:t>
+        <w:t>Communicatie</w:t>
       </w:r>
     </w:p>
     <w:p>
@@ -1431,28 +1390,8 @@
         <w:t xml:space="preserve"> </w:t>
       </w:r>
       <w:r>
-        <w:t>…</w:t>
-      </w:r>
-    </w:p>
-    <w:p>
-      <w:pPr>
-        <w:pStyle w:val="ListParagraph"/>
-        <w:numPr>
-          <w:ilvl w:val="0"/>
-          <w:numId w:val="12"/>
-        </w:numPr>
-      </w:pPr>
-      <w:r>
-        <w:t xml:space="preserve"> </w:t>
-      </w:r>
-      <w:r>
-        <w:t>…</w:t>
-      </w:r>
-    </w:p>
-    <w:p>
-      <w:pPr>
-        <w:ind w:left="720"/>
-      </w:pPr>
+        <w:t>Kwaliteit werk</w:t>
+      </w:r>
     </w:p>
     <w:p>
       <w:pPr>
@@ -1478,7 +1417,7 @@
         </w:numPr>
       </w:pPr>
       <w:r>
-        <w:t>…</w:t>
+        <w:t>Samenwerken</w:t>
       </w:r>
     </w:p>
     <w:p>
@@ -1493,31 +1432,8 @@
         <w:t xml:space="preserve"> </w:t>
       </w:r>
       <w:r>
-        <w:t>…</w:t>
-      </w:r>
-    </w:p>
-    <w:p>
-      <w:pPr>
-        <w:pStyle w:val="ListParagraph"/>
-        <w:numPr>
-          <w:ilvl w:val="0"/>
-          <w:numId w:val="13"/>
-        </w:numPr>
-      </w:pPr>
-      <w:r>
-        <w:t xml:space="preserve"> </w:t>
-      </w:r>
-      <w:r>
-        <w:t>…</w:t>
-      </w:r>
-    </w:p>
-    <w:p>
-      <w:pPr>
-        <w:rPr>
-          <w:b/>
-          <w:bCs/>
-        </w:rPr>
-      </w:pPr>
+        <w:t>Overleggen</w:t>
+      </w:r>
     </w:p>
     <w:p>
       <w:pPr>
@@ -1543,7 +1459,7 @@
     </w:p>
     <w:p>
       <w:r>
-        <w:t>…</w:t>
+        <w:t>Het overleggen.</w:t>
       </w:r>
     </w:p>
     <w:p>
@@ -1572,10 +1488,7 @@
         <w:br/>
       </w:r>
       <w:r>
-        <w:t xml:space="preserve">Naam rol eigenaar: </w:t>
-      </w:r>
-      <w:r>
-        <w:t>Yorick Klaasen</w:t>
+        <w:t>Naam rol eigenaar: Yorick Klaasen</w:t>
       </w:r>
     </w:p>
     <w:p>
@@ -1996,7 +1909,6 @@
                 <w:b/>
                 <w:bCs/>
               </w:rPr>
-              <w:lastRenderedPageBreak/>
               <w:t>Samenwerking</w:t>
             </w:r>
           </w:p>
@@ -2070,6 +1982,7 @@
                 <w:b/>
                 <w:bCs/>
               </w:rPr>
+              <w:lastRenderedPageBreak/>
               <w:t xml:space="preserve">Initiatief &amp; </w:t>
             </w:r>
             <w:r>
@@ -2249,10 +2162,7 @@
         <w:br/>
       </w:r>
       <w:r>
-        <w:t xml:space="preserve">Naam rol eigenaar: </w:t>
-      </w:r>
-      <w:r>
-        <w:t>Ruben Stender</w:t>
+        <w:t>Naam rol eigenaar: Ruben Stender</w:t>
       </w:r>
     </w:p>
     <w:p>
@@ -2510,7 +2420,10 @@
               <w:spacing w:after="0"/>
             </w:pPr>
             <w:r>
-              <w:t>…</w:t>
+              <w:t>Ja</w:t>
+            </w:r>
+            <w:r>
+              <w:t xml:space="preserve"> hij had op tijd zijn UI af.</w:t>
             </w:r>
           </w:p>
         </w:tc>
@@ -2579,7 +2492,7 @@
               <w:spacing w:after="0"/>
             </w:pPr>
             <w:r>
-              <w:t>…</w:t>
+              <w:t>De kwaliteit was goed van zijn deliverables.</w:t>
             </w:r>
           </w:p>
         </w:tc>
@@ -2648,7 +2561,7 @@
               <w:spacing w:after="0"/>
             </w:pPr>
             <w:r>
-              <w:t>…</w:t>
+              <w:t>Communicatie was voldoende maar groep helemaal ging het beetje slecht voor iedereen.</w:t>
             </w:r>
           </w:p>
         </w:tc>
@@ -2672,7 +2585,6 @@
                 <w:b/>
                 <w:bCs/>
               </w:rPr>
-              <w:lastRenderedPageBreak/>
               <w:t>Samenwerking</w:t>
             </w:r>
           </w:p>
@@ -2718,7 +2630,7 @@
               <w:spacing w:after="0"/>
             </w:pPr>
             <w:r>
-              <w:t>…</w:t>
+              <w:t>Samenwerking ging ook goed hij zij wanneer hij iets nodig had van ons.</w:t>
             </w:r>
           </w:p>
         </w:tc>
@@ -2746,6 +2658,7 @@
                 <w:b/>
                 <w:bCs/>
               </w:rPr>
+              <w:lastRenderedPageBreak/>
               <w:t xml:space="preserve">Initiatief &amp; </w:t>
             </w:r>
             <w:r>
@@ -2805,7 +2718,7 @@
               <w:spacing w:after="0"/>
             </w:pPr>
             <w:r>
-              <w:t>…</w:t>
+              <w:t>Hij nam goed initiatief.</w:t>
             </w:r>
           </w:p>
         </w:tc>
@@ -2842,7 +2755,7 @@
         <w:t xml:space="preserve"> </w:t>
       </w:r>
       <w:r>
-        <w:t>…</w:t>
+        <w:t>Had goed en op tijd zijn werk af.</w:t>
       </w:r>
     </w:p>
     <w:p>
@@ -2857,28 +2770,8 @@
         <w:t xml:space="preserve"> </w:t>
       </w:r>
       <w:r>
-        <w:t>…</w:t>
-      </w:r>
-    </w:p>
-    <w:p>
-      <w:pPr>
-        <w:pStyle w:val="ListParagraph"/>
-        <w:numPr>
-          <w:ilvl w:val="0"/>
-          <w:numId w:val="12"/>
-        </w:numPr>
-      </w:pPr>
-      <w:r>
-        <w:t xml:space="preserve"> </w:t>
-      </w:r>
-      <w:r>
-        <w:t>…</w:t>
-      </w:r>
-    </w:p>
-    <w:p>
-      <w:pPr>
-        <w:ind w:left="720"/>
-      </w:pPr>
+        <w:t>Hij zei wanneer hij iets nodig had.</w:t>
+      </w:r>
     </w:p>
     <w:p>
       <w:pPr>
@@ -2904,46 +2797,8 @@
         </w:numPr>
       </w:pPr>
       <w:r>
-        <w:t>…</w:t>
-      </w:r>
-    </w:p>
-    <w:p>
-      <w:pPr>
-        <w:pStyle w:val="ListParagraph"/>
-        <w:numPr>
-          <w:ilvl w:val="0"/>
-          <w:numId w:val="13"/>
-        </w:numPr>
-      </w:pPr>
-      <w:r>
-        <w:t xml:space="preserve"> </w:t>
-      </w:r>
-      <w:r>
-        <w:t>…</w:t>
-      </w:r>
-    </w:p>
-    <w:p>
-      <w:pPr>
-        <w:pStyle w:val="ListParagraph"/>
-        <w:numPr>
-          <w:ilvl w:val="0"/>
-          <w:numId w:val="13"/>
-        </w:numPr>
-      </w:pPr>
-      <w:r>
-        <w:t xml:space="preserve"> </w:t>
-      </w:r>
-      <w:r>
-        <w:t>…</w:t>
-      </w:r>
-    </w:p>
-    <w:p>
-      <w:pPr>
-        <w:rPr>
-          <w:b/>
-          <w:bCs/>
-        </w:rPr>
-      </w:pPr>
+        <w:t>Overleggen maar dat geldt voor iedereen</w:t>
+      </w:r>
     </w:p>
     <w:p>
       <w:pPr>
@@ -2969,7 +2824,7 @@
     </w:p>
     <w:p>
       <w:r>
-        <w:t>…</w:t>
+        <w:t>Team Overleg</w:t>
       </w:r>
     </w:p>
     <w:p>
@@ -2998,10 +2853,7 @@
         <w:br/>
       </w:r>
       <w:r>
-        <w:t xml:space="preserve">Naam rol eigenaar: </w:t>
-      </w:r>
-      <w:r>
-        <w:t>Esat Yavuz</w:t>
+        <w:t>Naam rol eigenaar: Esat Yavuz</w:t>
       </w:r>
     </w:p>
     <w:p>
@@ -3112,7 +2964,6 @@
                 <w:b/>
                 <w:bCs/>
               </w:rPr>
-              <w:lastRenderedPageBreak/>
               <w:t>Categorie</w:t>
             </w:r>
           </w:p>
@@ -3245,7 +3096,7 @@
               <w:jc w:val="center"/>
             </w:pPr>
             <w:r>
-              <w:t>O/M/V/G</w:t>
+              <w:t>O</w:t>
             </w:r>
           </w:p>
         </w:tc>
@@ -3260,7 +3111,7 @@
               <w:spacing w:after="0"/>
             </w:pPr>
             <w:r>
-              <w:t>…</w:t>
+              <w:t>Hij nam niet echt verantwoordelijkheid want hij was ziek voor grootendeels van de week en had niet echt gezorgd voor versiebeheer of kwaliteit van het programeerwerk</w:t>
             </w:r>
           </w:p>
         </w:tc>
@@ -3315,7 +3166,7 @@
               <w:jc w:val="center"/>
             </w:pPr>
             <w:r>
-              <w:t>O/M/V/G</w:t>
+              <w:t>M</w:t>
             </w:r>
           </w:p>
         </w:tc>
@@ -3329,7 +3180,7 @@
               <w:spacing w:after="0"/>
             </w:pPr>
             <w:r>
-              <w:t>…</w:t>
+              <w:t>Ik weet niet echt of het werkte maar team zij dat het half werkte</w:t>
             </w:r>
           </w:p>
         </w:tc>
@@ -3353,6 +3204,7 @@
                 <w:b/>
                 <w:bCs/>
               </w:rPr>
+              <w:lastRenderedPageBreak/>
               <w:t>Communicatie</w:t>
             </w:r>
           </w:p>
@@ -3384,7 +3236,7 @@
               <w:jc w:val="center"/>
             </w:pPr>
             <w:r>
-              <w:t>O/M/V/G</w:t>
+              <w:t>M</w:t>
             </w:r>
           </w:p>
         </w:tc>
@@ -3398,7 +3250,7 @@
               <w:spacing w:after="0"/>
             </w:pPr>
             <w:r>
-              <w:t>…</w:t>
+              <w:t>Voor de dagen wanneer die op school was communiceerde hij ok maar hij was ook grootendeels ziek</w:t>
             </w:r>
           </w:p>
         </w:tc>
@@ -3453,7 +3305,7 @@
               <w:jc w:val="center"/>
             </w:pPr>
             <w:r>
-              <w:t>O/M/V/G</w:t>
+              <w:t>M</w:t>
             </w:r>
           </w:p>
         </w:tc>
@@ -3467,7 +3319,7 @@
               <w:spacing w:after="0"/>
             </w:pPr>
             <w:r>
-              <w:t>…</w:t>
+              <w:t>Soort van hij was er namelijk niet echt.</w:t>
             </w:r>
           </w:p>
         </w:tc>
@@ -3540,7 +3392,7 @@
               <w:jc w:val="center"/>
             </w:pPr>
             <w:r>
-              <w:t>O/M/V/G</w:t>
+              <w:t>M</w:t>
             </w:r>
           </w:p>
         </w:tc>
@@ -3554,7 +3406,7 @@
               <w:spacing w:after="0"/>
             </w:pPr>
             <w:r>
-              <w:t>…</w:t>
+              <w:t>Niet echt want zijn script werkte half en hij was er bijna niet.</w:t>
             </w:r>
           </w:p>
         </w:tc>
@@ -3591,43 +3443,8 @@
         <w:t xml:space="preserve"> </w:t>
       </w:r>
       <w:r>
-        <w:t>…</w:t>
-      </w:r>
-    </w:p>
-    <w:p>
-      <w:pPr>
-        <w:pStyle w:val="ListParagraph"/>
-        <w:numPr>
-          <w:ilvl w:val="0"/>
-          <w:numId w:val="12"/>
-        </w:numPr>
-      </w:pPr>
-      <w:r>
-        <w:t xml:space="preserve"> </w:t>
-      </w:r>
-      <w:r>
-        <w:t>…</w:t>
-      </w:r>
-    </w:p>
-    <w:p>
-      <w:pPr>
-        <w:pStyle w:val="ListParagraph"/>
-        <w:numPr>
-          <w:ilvl w:val="0"/>
-          <w:numId w:val="12"/>
-        </w:numPr>
-      </w:pPr>
-      <w:r>
-        <w:t xml:space="preserve"> </w:t>
-      </w:r>
-      <w:r>
-        <w:t>…</w:t>
-      </w:r>
-    </w:p>
-    <w:p>
-      <w:pPr>
-        <w:ind w:left="720"/>
-      </w:pPr>
+        <w:t>Weet ik eigenlijk niet want hij was er bijna niet</w:t>
+      </w:r>
     </w:p>
     <w:p>
       <w:pPr>
@@ -3653,46 +3470,8 @@
         </w:numPr>
       </w:pPr>
       <w:r>
-        <w:t>…</w:t>
-      </w:r>
-    </w:p>
-    <w:p>
-      <w:pPr>
-        <w:pStyle w:val="ListParagraph"/>
-        <w:numPr>
-          <w:ilvl w:val="0"/>
-          <w:numId w:val="13"/>
-        </w:numPr>
-      </w:pPr>
-      <w:r>
-        <w:t xml:space="preserve"> </w:t>
-      </w:r>
-      <w:r>
-        <w:t>…</w:t>
-      </w:r>
-    </w:p>
-    <w:p>
-      <w:pPr>
-        <w:pStyle w:val="ListParagraph"/>
-        <w:numPr>
-          <w:ilvl w:val="0"/>
-          <w:numId w:val="13"/>
-        </w:numPr>
-      </w:pPr>
-      <w:r>
-        <w:t xml:space="preserve"> </w:t>
-      </w:r>
-      <w:r>
-        <w:t>…</w:t>
-      </w:r>
-    </w:p>
-    <w:p>
-      <w:pPr>
-        <w:rPr>
-          <w:b/>
-          <w:bCs/>
-        </w:rPr>
-      </w:pPr>
+        <w:t>Zijn Rol uitvoeren</w:t>
+      </w:r>
     </w:p>
     <w:p>
       <w:pPr>
@@ -3718,7 +3497,7 @@
     </w:p>
     <w:p>
       <w:r>
-        <w:t>…</w:t>
+        <w:t>Meer zijn taak doen.</w:t>
       </w:r>
     </w:p>
     <w:p>
@@ -3747,19 +3526,15 @@
         <w:br/>
       </w:r>
       <w:r>
-        <w:t xml:space="preserve">Naam rol eigenaar: </w:t>
-      </w:r>
-      <w:r>
-        <w:t>Gido Verhoef</w:t>
-      </w:r>
-    </w:p>
-    <w:p>
-      <w:r>
-        <w:rPr>
-          <w:b/>
-          <w:bCs/>
-        </w:rPr>
-        <w:lastRenderedPageBreak/>
+        <w:t>Naam rol eigenaar: Gido Verhoef</w:t>
+      </w:r>
+    </w:p>
+    <w:p>
+      <w:r>
+        <w:rPr>
+          <w:b/>
+          <w:bCs/>
+        </w:rPr>
         <w:t>Verwachte deliverables</w:t>
       </w:r>
       <w:r>
@@ -3878,6 +3653,7 @@
                 <w:b/>
                 <w:bCs/>
               </w:rPr>
+              <w:lastRenderedPageBreak/>
               <w:t>Categorie</w:t>
             </w:r>
           </w:p>
@@ -4010,7 +3786,7 @@
               <w:jc w:val="center"/>
             </w:pPr>
             <w:r>
-              <w:t>O/M/V/G</w:t>
+              <w:t>V</w:t>
             </w:r>
           </w:p>
         </w:tc>
@@ -4025,7 +3801,7 @@
               <w:spacing w:after="0"/>
             </w:pPr>
             <w:r>
-              <w:t>…</w:t>
+              <w:t>Hij nam goed verantwoordelijkheid en zorgde dat alles op trello stond</w:t>
             </w:r>
           </w:p>
         </w:tc>
@@ -4080,7 +3856,7 @@
               <w:jc w:val="center"/>
             </w:pPr>
             <w:r>
-              <w:t>O/M/V/G</w:t>
+              <w:t>V</w:t>
             </w:r>
           </w:p>
         </w:tc>
@@ -4094,7 +3870,7 @@
               <w:spacing w:after="0"/>
             </w:pPr>
             <w:r>
-              <w:t>…</w:t>
+              <w:t>Hij had het trello in elkaar gezet maar niet echt het onderhouden want dat deed iedereen zelf</w:t>
             </w:r>
           </w:p>
         </w:tc>
@@ -4149,7 +3925,7 @@
               <w:jc w:val="center"/>
             </w:pPr>
             <w:r>
-              <w:t>O/M/V/G</w:t>
+              <w:t>V</w:t>
             </w:r>
           </w:p>
         </w:tc>
@@ -4163,7 +3939,7 @@
               <w:spacing w:after="0"/>
             </w:pPr>
             <w:r>
-              <w:t>…</w:t>
+              <w:t>Hij communiceerde goed met ons</w:t>
             </w:r>
           </w:p>
         </w:tc>
@@ -4218,7 +3994,7 @@
               <w:jc w:val="center"/>
             </w:pPr>
             <w:r>
-              <w:t>O/M/V/G</w:t>
+              <w:t>V</w:t>
             </w:r>
           </w:p>
         </w:tc>
@@ -4232,7 +4008,7 @@
               <w:spacing w:after="0"/>
             </w:pPr>
             <w:r>
-              <w:t>…</w:t>
+              <w:t>De samenwerking ging ook wel goed.</w:t>
             </w:r>
           </w:p>
         </w:tc>
@@ -4305,7 +4081,7 @@
               <w:jc w:val="center"/>
             </w:pPr>
             <w:r>
-              <w:t>O/M/V/G</w:t>
+              <w:t>V</w:t>
             </w:r>
           </w:p>
         </w:tc>
@@ -4319,7 +4095,7 @@
               <w:spacing w:after="0"/>
             </w:pPr>
             <w:r>
-              <w:t>…</w:t>
+              <w:t>Hij nam wel iniatief.</w:t>
             </w:r>
           </w:p>
         </w:tc>
@@ -4356,37 +4132,7 @@
         <w:t xml:space="preserve"> </w:t>
       </w:r>
       <w:r>
-        <w:t>…</w:t>
-      </w:r>
-    </w:p>
-    <w:p>
-      <w:pPr>
-        <w:pStyle w:val="ListParagraph"/>
-        <w:numPr>
-          <w:ilvl w:val="0"/>
-          <w:numId w:val="12"/>
-        </w:numPr>
-      </w:pPr>
-      <w:r>
-        <w:t xml:space="preserve"> </w:t>
-      </w:r>
-      <w:r>
-        <w:t>…</w:t>
-      </w:r>
-    </w:p>
-    <w:p>
-      <w:pPr>
-        <w:pStyle w:val="ListParagraph"/>
-        <w:numPr>
-          <w:ilvl w:val="0"/>
-          <w:numId w:val="12"/>
-        </w:numPr>
-      </w:pPr>
-      <w:r>
-        <w:t xml:space="preserve"> </w:t>
-      </w:r>
-      <w:r>
-        <w:t>…</w:t>
+        <w:t>Had op tijd zijn werk af</w:t>
       </w:r>
     </w:p>
     <w:p>
@@ -4418,37 +4164,10 @@
         </w:numPr>
       </w:pPr>
       <w:r>
-        <w:t>…</w:t>
-      </w:r>
-    </w:p>
-    <w:p>
-      <w:pPr>
-        <w:pStyle w:val="ListParagraph"/>
-        <w:numPr>
-          <w:ilvl w:val="0"/>
-          <w:numId w:val="13"/>
-        </w:numPr>
-      </w:pPr>
-      <w:r>
-        <w:t xml:space="preserve"> </w:t>
-      </w:r>
-      <w:r>
-        <w:t>…</w:t>
-      </w:r>
-    </w:p>
-    <w:p>
-      <w:pPr>
-        <w:pStyle w:val="ListParagraph"/>
-        <w:numPr>
-          <w:ilvl w:val="0"/>
-          <w:numId w:val="13"/>
-        </w:numPr>
-      </w:pPr>
-      <w:r>
-        <w:t xml:space="preserve"> </w:t>
-      </w:r>
-      <w:r>
-        <w:t>…</w:t>
+        <w:t>Communicatie</w:t>
+      </w:r>
+      <w:r>
+        <w:t xml:space="preserve"> Met het team</w:t>
       </w:r>
     </w:p>
     <w:p>
@@ -4483,7 +4202,7 @@
     </w:p>
     <w:p>
       <w:r>
-        <w:t>…</w:t>
+        <w:t>Meer communiceren met het team</w:t>
       </w:r>
     </w:p>
     <w:p>
@@ -4512,10 +4231,7 @@
         <w:br/>
       </w:r>
       <w:r>
-        <w:t xml:space="preserve">Naam rol eigenaar: </w:t>
-      </w:r>
-      <w:r>
-        <w:t>Daniël Kosters</w:t>
+        <w:t>Naam rol eigenaar: Daniël Kosters</w:t>
       </w:r>
     </w:p>
     <w:p>
@@ -4539,6 +4255,7 @@
         </w:numPr>
       </w:pPr>
       <w:r>
+        <w:lastRenderedPageBreak/>
         <w:t xml:space="preserve"> </w:t>
       </w:r>
       <w:r>
@@ -4758,7 +4475,7 @@
               <w:jc w:val="center"/>
             </w:pPr>
             <w:r>
-              <w:t>O/M/V/G</w:t>
+              <w:t>M</w:t>
             </w:r>
           </w:p>
         </w:tc>
@@ -4773,7 +4490,7 @@
               <w:spacing w:after="0"/>
             </w:pPr>
             <w:r>
-              <w:t>…</w:t>
+              <w:t>Hij had geen testplan gemaakt maar meer zelf getest</w:t>
             </w:r>
           </w:p>
         </w:tc>
@@ -4828,7 +4545,7 @@
               <w:jc w:val="center"/>
             </w:pPr>
             <w:r>
-              <w:t>O/M/V/G</w:t>
+              <w:t>O</w:t>
             </w:r>
           </w:p>
         </w:tc>
@@ -4842,7 +4559,7 @@
               <w:spacing w:after="0"/>
             </w:pPr>
             <w:r>
-              <w:t>…</w:t>
+              <w:t>Hij heeft geen Testplan gemaakt of uitgevoerd</w:t>
             </w:r>
           </w:p>
         </w:tc>
@@ -4897,7 +4614,7 @@
               <w:jc w:val="center"/>
             </w:pPr>
             <w:r>
-              <w:t>O/M/V/G</w:t>
+              <w:t>V</w:t>
             </w:r>
           </w:p>
         </w:tc>
@@ -4911,7 +4628,7 @@
               <w:spacing w:after="0"/>
             </w:pPr>
             <w:r>
-              <w:t>…</w:t>
+              <w:t>Hij communiceerde qua zijn taak wel goed maar met zijn rol alleen echt aan Gido.</w:t>
             </w:r>
           </w:p>
         </w:tc>
@@ -4966,7 +4683,7 @@
               <w:jc w:val="center"/>
             </w:pPr>
             <w:r>
-              <w:t>O/M/V/G</w:t>
+              <w:t>V</w:t>
             </w:r>
           </w:p>
         </w:tc>
@@ -4980,7 +4697,7 @@
               <w:spacing w:after="0"/>
             </w:pPr>
             <w:r>
-              <w:t>…</w:t>
+              <w:t>Hij was goed aan het samenwerken en stelde een vraag als hij informatie nodig had</w:t>
             </w:r>
           </w:p>
         </w:tc>
@@ -5053,7 +4770,7 @@
               <w:jc w:val="center"/>
             </w:pPr>
             <w:r>
-              <w:t>O/M/V/G</w:t>
+              <w:t>V</w:t>
             </w:r>
           </w:p>
         </w:tc>
@@ -5067,7 +4784,7 @@
               <w:spacing w:after="0"/>
             </w:pPr>
             <w:r>
-              <w:t>…</w:t>
+              <w:t>Ja hij gaf ons af en toe feedback op ons werk of hielp ons ermee.</w:t>
             </w:r>
           </w:p>
         </w:tc>
@@ -5104,57 +4821,21 @@
         <w:t xml:space="preserve"> </w:t>
       </w:r>
       <w:r>
-        <w:t>…</w:t>
-      </w:r>
-    </w:p>
-    <w:p>
-      <w:pPr>
-        <w:pStyle w:val="ListParagraph"/>
-        <w:numPr>
-          <w:ilvl w:val="0"/>
-          <w:numId w:val="12"/>
-        </w:numPr>
-      </w:pPr>
-      <w:r>
-        <w:t xml:space="preserve"> </w:t>
-      </w:r>
-      <w:r>
-        <w:t>…</w:t>
-      </w:r>
-    </w:p>
-    <w:p>
-      <w:pPr>
-        <w:pStyle w:val="ListParagraph"/>
-        <w:numPr>
-          <w:ilvl w:val="0"/>
-          <w:numId w:val="12"/>
-        </w:numPr>
-      </w:pPr>
-      <w:r>
-        <w:t xml:space="preserve"> </w:t>
-      </w:r>
-      <w:r>
-        <w:t>…</w:t>
-      </w:r>
-    </w:p>
-    <w:p>
-      <w:pPr>
-        <w:ind w:left="720"/>
-      </w:pPr>
-    </w:p>
-    <w:p>
-      <w:pPr>
-        <w:rPr>
-          <w:b/>
-          <w:bCs/>
-        </w:rPr>
-      </w:pPr>
-      <w:r>
-        <w:rPr>
-          <w:b/>
-          <w:bCs/>
-        </w:rPr>
-        <w:lastRenderedPageBreak/>
+        <w:t>Het samenwerken</w:t>
+      </w:r>
+    </w:p>
+    <w:p>
+      <w:pPr>
+        <w:rPr>
+          <w:b/>
+          <w:bCs/>
+        </w:rPr>
+      </w:pPr>
+      <w:r>
+        <w:rPr>
+          <w:b/>
+          <w:bCs/>
+        </w:rPr>
         <w:t>4. Verbeterpunten</w:t>
       </w:r>
     </w:p>
@@ -5167,46 +4848,8 @@
         </w:numPr>
       </w:pPr>
       <w:r>
-        <w:t>…</w:t>
-      </w:r>
-    </w:p>
-    <w:p>
-      <w:pPr>
-        <w:pStyle w:val="ListParagraph"/>
-        <w:numPr>
-          <w:ilvl w:val="0"/>
-          <w:numId w:val="13"/>
-        </w:numPr>
-      </w:pPr>
-      <w:r>
-        <w:t xml:space="preserve"> </w:t>
-      </w:r>
-      <w:r>
-        <w:t>…</w:t>
-      </w:r>
-    </w:p>
-    <w:p>
-      <w:pPr>
-        <w:pStyle w:val="ListParagraph"/>
-        <w:numPr>
-          <w:ilvl w:val="0"/>
-          <w:numId w:val="13"/>
-        </w:numPr>
-      </w:pPr>
-      <w:r>
-        <w:t xml:space="preserve"> </w:t>
-      </w:r>
-      <w:r>
-        <w:t>…</w:t>
-      </w:r>
-    </w:p>
-    <w:p>
-      <w:pPr>
-        <w:rPr>
-          <w:b/>
-          <w:bCs/>
-        </w:rPr>
-      </w:pPr>
+        <w:t>Op tijd testen en anders onderdelen van het spel ipv complete game.</w:t>
+      </w:r>
     </w:p>
     <w:p>
       <w:pPr>
@@ -5232,10 +4875,9 @@
     </w:p>
     <w:p>
       <w:r>
-        <w:t>…</w:t>
-      </w:r>
-    </w:p>
-    <w:p/>
+        <w:t>Vragen voor testen ook aan andere mensen.</w:t>
+      </w:r>
+    </w:p>
     <w:sectPr>
       <w:pgSz w:w="12240" w:h="15840"/>
       <w:pgMar w:top="1440" w:right="1440" w:bottom="1440" w:left="1440" w:header="720" w:footer="720" w:gutter="0"/>
@@ -7558,6 +7200,26 @@
 </file>
 
 <file path=customXml/item1.xml><?xml version="1.0" encoding="utf-8"?>
+<p:properties xmlns:p="http://schemas.microsoft.com/office/2006/metadata/properties" xmlns:xsi="http://www.w3.org/2001/XMLSchema-instance" xmlns:pc="http://schemas.microsoft.com/office/infopath/2007/PartnerControls">
+  <documentManagement>
+    <TaxCatchAll xmlns="32dd6115-ce5d-46b4-b638-9e7d5ca6cbee" xsi:nil="true"/>
+    <lcf76f155ced4ddcb4097134ff3c332f xmlns="094ecc41-7a37-40c9-8390-f18431712098">
+      <Terms xmlns="http://schemas.microsoft.com/office/infopath/2007/PartnerControls"/>
+    </lcf76f155ced4ddcb4097134ff3c332f>
+  </documentManagement>
+</p:properties>
+</file>
+
+<file path=customXml/item2.xml><?xml version="1.0" encoding="utf-8"?>
+<?mso-contentType ?>
+<FormTemplates xmlns="http://schemas.microsoft.com/sharepoint/v3/contenttype/forms">
+  <Display>DocumentLibraryForm</Display>
+  <Edit>DocumentLibraryForm</Edit>
+  <New>DocumentLibraryForm</New>
+</FormTemplates>
+</file>
+
+<file path=customXml/item3.xml><?xml version="1.0" encoding="utf-8"?>
 <ct:contentTypeSchema xmlns:ct="http://schemas.microsoft.com/office/2006/metadata/contentType" xmlns:ma="http://schemas.microsoft.com/office/2006/metadata/properties/metaAttributes" ct:_="" ma:_="" ma:contentTypeName="Document" ma:contentTypeID="0x010100D5188FA4F7421B4A93E65E307A769E27" ma:contentTypeVersion="15" ma:contentTypeDescription="Een nieuw document maken." ma:contentTypeScope="" ma:versionID="9bfd002f47f5f7e7b2724518f3fad1a5">
   <xsd:schema xmlns:xsd="http://www.w3.org/2001/XMLSchema" xmlns:xs="http://www.w3.org/2001/XMLSchema" xmlns:p="http://schemas.microsoft.com/office/2006/metadata/properties" xmlns:ns2="094ecc41-7a37-40c9-8390-f18431712098" xmlns:ns3="32dd6115-ce5d-46b4-b638-9e7d5ca6cbee" targetNamespace="http://schemas.microsoft.com/office/2006/metadata/properties" ma:root="true" ma:fieldsID="e2c1118370456e9a6d2939e9bd0f2e89" ns2:_="" ns3:_="">
     <xsd:import namespace="094ecc41-7a37-40c9-8390-f18431712098"/>
@@ -7792,27 +7454,26 @@
 </ct:contentTypeSchema>
 </file>
 
-<file path=customXml/item2.xml><?xml version="1.0" encoding="utf-8"?>
-<?mso-contentType ?>
-<FormTemplates xmlns="http://schemas.microsoft.com/sharepoint/v3/contenttype/forms">
-  <Display>DocumentLibraryForm</Display>
-  <Edit>DocumentLibraryForm</Edit>
-  <New>DocumentLibraryForm</New>
-</FormTemplates>
+<file path=customXml/itemProps1.xml><?xml version="1.0" encoding="utf-8"?>
+<ds:datastoreItem xmlns:ds="http://schemas.openxmlformats.org/officeDocument/2006/customXml" ds:itemID="{12922F36-55F1-486C-AA45-86287294FBCC}">
+  <ds:schemaRefs>
+    <ds:schemaRef ds:uri="http://schemas.microsoft.com/office/2006/metadata/properties"/>
+    <ds:schemaRef ds:uri="http://schemas.microsoft.com/office/infopath/2007/PartnerControls"/>
+    <ds:schemaRef ds:uri="32dd6115-ce5d-46b4-b638-9e7d5ca6cbee"/>
+    <ds:schemaRef ds:uri="094ecc41-7a37-40c9-8390-f18431712098"/>
+  </ds:schemaRefs>
+</ds:datastoreItem>
 </file>
 
-<file path=customXml/item3.xml><?xml version="1.0" encoding="utf-8"?>
-<p:properties xmlns:p="http://schemas.microsoft.com/office/2006/metadata/properties" xmlns:xsi="http://www.w3.org/2001/XMLSchema-instance" xmlns:pc="http://schemas.microsoft.com/office/infopath/2007/PartnerControls">
-  <documentManagement>
-    <TaxCatchAll xmlns="32dd6115-ce5d-46b4-b638-9e7d5ca6cbee" xsi:nil="true"/>
-    <lcf76f155ced4ddcb4097134ff3c332f xmlns="094ecc41-7a37-40c9-8390-f18431712098">
-      <Terms xmlns="http://schemas.microsoft.com/office/infopath/2007/PartnerControls"/>
-    </lcf76f155ced4ddcb4097134ff3c332f>
-  </documentManagement>
-</p:properties>
+<file path=customXml/itemProps2.xml><?xml version="1.0" encoding="utf-8"?>
+<ds:datastoreItem xmlns:ds="http://schemas.openxmlformats.org/officeDocument/2006/customXml" ds:itemID="{2ABD75BD-0EC0-4203-BD0D-0E29491F4147}">
+  <ds:schemaRefs>
+    <ds:schemaRef ds:uri="http://schemas.microsoft.com/sharepoint/v3/contenttype/forms"/>
+  </ds:schemaRefs>
+</ds:datastoreItem>
 </file>
 
-<file path=customXml/itemProps1.xml><?xml version="1.0" encoding="utf-8"?>
+<file path=customXml/itemProps3.xml><?xml version="1.0" encoding="utf-8"?>
 <ds:datastoreItem xmlns:ds="http://schemas.openxmlformats.org/officeDocument/2006/customXml" ds:itemID="{A14AD147-08DA-47D4-8F12-6F6A85430E28}">
   <ds:schemaRefs>
     <ds:schemaRef ds:uri="http://schemas.microsoft.com/office/2006/metadata/contentType"/>
@@ -7829,23 +7490,4 @@
     <ds:schemaRef ds:uri="http://schemas.microsoft.com/internal/obd"/>
   </ds:schemaRefs>
 </ds:datastoreItem>
-</file>
-
-<file path=customXml/itemProps2.xml><?xml version="1.0" encoding="utf-8"?>
-<ds:datastoreItem xmlns:ds="http://schemas.openxmlformats.org/officeDocument/2006/customXml" ds:itemID="{2ABD75BD-0EC0-4203-BD0D-0E29491F4147}">
-  <ds:schemaRefs>
-    <ds:schemaRef ds:uri="http://schemas.microsoft.com/sharepoint/v3/contenttype/forms"/>
-  </ds:schemaRefs>
-</ds:datastoreItem>
-</file>
-
-<file path=customXml/itemProps3.xml><?xml version="1.0" encoding="utf-8"?>
-<ds:datastoreItem xmlns:ds="http://schemas.openxmlformats.org/officeDocument/2006/customXml" ds:itemID="{12922F36-55F1-486C-AA45-86287294FBCC}">
-  <ds:schemaRefs>
-    <ds:schemaRef ds:uri="http://schemas.microsoft.com/office/2006/metadata/properties"/>
-    <ds:schemaRef ds:uri="http://schemas.microsoft.com/office/infopath/2007/PartnerControls"/>
-    <ds:schemaRef ds:uri="32dd6115-ce5d-46b4-b638-9e7d5ca6cbee"/>
-    <ds:schemaRef ds:uri="094ecc41-7a37-40c9-8390-f18431712098"/>
-  </ds:schemaRefs>
-</ds:datastoreItem>
 </file>
</xml_diff>